<commit_message>
refactor: update quotes api and lending docx to use inquiry review instead of rate lock
</commit_message>
<xml_diff>
--- a/public/AI_Agent_Era_Lending_Market_Research.docx
+++ b/public/AI_Agent_Era_Lending_Market_Research.docx
@@ -210,12 +210,12 @@
           <w:b/>
           <w:color w:val="1E293B"/>
         </w:rPr>
-        <w:t>4. The Power of A2A (Agent-to-Agent) Conversational Locking</w:t>
+        <w:t>4. The Power of A2A (Agent-to-Agent) Conversational Inquiries</w:t>
       </w:r>
     </w:p>
     <w:p>
       <w:r>
-        <w:t>A2A communication represents the future of lead capture. By deploying an OpenAPI specification (openapi.yaml) on the site, brokers enable external LLMs to interact with their quoting engines directly. A buyer discussing a property inside ChatGPT can request an instant quote, qualify for a DSCR loan program, and submit a rate lock request without ever filling out a standard web form.</w:t>
+        <w:t>A2A communication represents the future of lead capture. By deploying an OpenAPI specification (openapi.yaml) on the site, brokers enable external LLMs to interact with their quoting engines directly. A buyer discussing a property inside ChatGPT can request an instant quote, qualify for a DSCR loan program, and submit a quote inquiry request without ever filling out a standard web form.</w:t>
       </w:r>
     </w:p>
     <w:p>

</xml_diff>